<commit_message>
feat: improve vacation report generation
</commit_message>
<xml_diff>
--- a/templates/vacation-report-template.docx
+++ b/templates/vacation-report-template.docx
@@ -30,8 +30,6 @@
         </w:rPr>
         <w:t>у</w:t>
       </w:r>
-      <w:bookmarkStart w:id="1" w:name="_GoBack"/>
-      <w:bookmarkEnd w:id="1"/>
       <w:r>
         <w:rPr>
           <w:rFonts w:ascii="Times New Roman" w:hAnsi="Times New Roman" w:eastAsia="Times New Roman"/>
@@ -103,6 +101,40 @@
         <w:ind w:right="-1" w:firstLine="709"/>
         <w:jc w:val="both"/>
         <w:rPr>
+          <w:rFonts w:hint="default" w:ascii="Times New Roman" w:hAnsi="Times New Roman" w:eastAsia="Times New Roman"/>
+          <w:sz w:val="28"/>
+        </w:rPr>
+      </w:pPr>
+      <w:r>
+        <w:rPr>
+          <w:rFonts w:hint="default" w:ascii="Times New Roman" w:hAnsi="Times New Roman" w:eastAsia="Times New Roman"/>
+          <w:sz w:val="28"/>
+        </w:rPr>
+        <w:t>{{#hasTravelDays}}</w:t>
+      </w:r>
+    </w:p>
+    <w:p>
+      <w:pPr>
+        <w:ind w:right="-1" w:firstLine="709"/>
+        <w:jc w:val="both"/>
+        <w:rPr>
+          <w:rFonts w:hint="default" w:ascii="Times New Roman" w:hAnsi="Times New Roman" w:eastAsia="Times New Roman"/>
+          <w:sz w:val="28"/>
+        </w:rPr>
+      </w:pPr>
+      <w:r>
+        <w:rPr>
+          <w:rFonts w:hint="default" w:ascii="Times New Roman" w:hAnsi="Times New Roman" w:eastAsia="Times New Roman"/>
+          <w:sz w:val="28"/>
+        </w:rPr>
+        <w:t>Також прошу надати {{travelDays}} ({{travelDaysWords}}) доби для слідування до місця проведення відпустки та в зворотному напрямку.</w:t>
+      </w:r>
+    </w:p>
+    <w:p>
+      <w:pPr>
+        <w:ind w:right="-1" w:firstLine="709"/>
+        <w:jc w:val="both"/>
+        <w:rPr>
           <w:rFonts w:ascii="Times New Roman" w:hAnsi="Times New Roman" w:cs="Times New Roman"/>
           <w:sz w:val="28"/>
           <w:szCs w:val="28"/>
@@ -113,7 +145,7 @@
           <w:rFonts w:ascii="Times New Roman" w:hAnsi="Times New Roman" w:eastAsia="Times New Roman"/>
           <w:sz w:val="28"/>
         </w:rPr>
-        <w:t>Також прошу надати {{travelDays}} ({{travelDaysWords}}) доби для слідування до місця проведення відпустки та в зворотному напрямку.</w:t>
+        <w:t>До місця проведення відпустки та у зворотному напрямку буду слідувати {{transport}}.</w:t>
       </w:r>
     </w:p>
     <w:p>
@@ -121,17 +153,26 @@
         <w:ind w:right="-1" w:firstLine="709"/>
         <w:jc w:val="both"/>
         <w:rPr>
-          <w:rFonts w:ascii="Times New Roman" w:hAnsi="Times New Roman" w:cs="Times New Roman"/>
-          <w:sz w:val="28"/>
-          <w:szCs w:val="28"/>
-        </w:rPr>
-      </w:pPr>
-      <w:r>
-        <w:rPr>
-          <w:rFonts w:ascii="Times New Roman" w:hAnsi="Times New Roman" w:eastAsia="Times New Roman"/>
-          <w:sz w:val="28"/>
-        </w:rPr>
-        <w:t>До місця проведення відпустки та у зворотному напрямку буду слідувати {{transport}}.</w:t>
+          <w:rFonts w:hint="default" w:ascii="Times New Roman" w:hAnsi="Times New Roman" w:eastAsia="Times New Roman"/>
+          <w:sz w:val="28"/>
+        </w:rPr>
+      </w:pPr>
+    </w:p>
+    <w:p>
+      <w:pPr>
+        <w:ind w:right="-1" w:firstLine="709"/>
+        <w:jc w:val="both"/>
+        <w:rPr>
+          <w:rFonts w:hint="default" w:ascii="Times New Roman" w:hAnsi="Times New Roman" w:eastAsia="Times New Roman"/>
+          <w:sz w:val="28"/>
+        </w:rPr>
+      </w:pPr>
+      <w:r>
+        <w:rPr>
+          <w:rFonts w:hint="default" w:ascii="Times New Roman" w:hAnsi="Times New Roman" w:eastAsia="Times New Roman"/>
+          <w:sz w:val="28"/>
+        </w:rPr>
+        <w:t>{{/hasTravelDays}}</w:t>
       </w:r>
     </w:p>
     <w:p>
@@ -221,7 +262,27 @@
           <w:i w:val="0"/>
           <w:sz w:val="28"/>
         </w:rPr>
-        <w:t>{{position}} {{squad}} {{platoon}} роти бойового забезпечення військової частини А4960</w:t>
+        <w:t xml:space="preserve">{{position}} {{squad}} </w:t>
+      </w:r>
+      <w:bookmarkStart w:id="1" w:name="_GoBack"/>
+      <w:bookmarkEnd w:id="1"/>
+      <w:r>
+        <w:rPr>
+          <w:rFonts w:hint="default" w:ascii="Times New Roman" w:hAnsi="Times New Roman" w:eastAsia="Times New Roman"/>
+          <w:b w:val="0"/>
+          <w:i w:val="0"/>
+          <w:sz w:val="28"/>
+        </w:rPr>
+        <w:t>{{platoonGenitive}}</w:t>
+      </w:r>
+      <w:r>
+        <w:rPr>
+          <w:rFonts w:ascii="Times New Roman" w:hAnsi="Times New Roman" w:eastAsia="Times New Roman"/>
+          <w:b w:val="0"/>
+          <w:i w:val="0"/>
+          <w:sz w:val="28"/>
+        </w:rPr>
+        <w:t xml:space="preserve"> роти бойового забезпечення військової частини А4960</w:t>
       </w:r>
     </w:p>
     <w:tbl>
@@ -259,6 +320,12 @@
             <w:insideH w:val="none" w:color="auto" w:sz="0" w:space="0"/>
             <w:insideV w:val="none" w:color="auto" w:sz="0" w:space="0"/>
           </w:tblBorders>
+          <w:tblCellMar>
+            <w:top w:w="0" w:type="dxa"/>
+            <w:left w:w="108" w:type="dxa"/>
+            <w:bottom w:w="0" w:type="dxa"/>
+            <w:right w:w="108" w:type="dxa"/>
+          </w:tblCellMar>
         </w:tblPrEx>
         <w:tc>
           <w:tcPr>
@@ -512,7 +579,9 @@
         </w:tblBorders>
         <w:tblLayout w:type="autofit"/>
         <w:tblCellMar>
+          <w:top w:w="0" w:type="dxa"/>
           <w:left w:w="108" w:type="dxa"/>
+          <w:bottom w:w="0" w:type="dxa"/>
           <w:right w:w="108" w:type="dxa"/>
         </w:tblCellMar>
       </w:tblPr>
@@ -531,7 +600,9 @@
             <w:insideV w:val="none" w:color="auto" w:sz="0" w:space="0"/>
           </w:tblBorders>
           <w:tblCellMar>
+            <w:top w:w="0" w:type="dxa"/>
             <w:left w:w="108" w:type="dxa"/>
+            <w:bottom w:w="0" w:type="dxa"/>
             <w:right w:w="108" w:type="dxa"/>
           </w:tblCellMar>
         </w:tblPrEx>
@@ -622,126 +693,9 @@
         </w:tblBorders>
         <w:tblLayout w:type="autofit"/>
         <w:tblCellMar>
+          <w:top w:w="0" w:type="dxa"/>
           <w:left w:w="108" w:type="dxa"/>
-          <w:right w:w="108" w:type="dxa"/>
-        </w:tblCellMar>
-      </w:tblPr>
-      <w:tblGrid>
-        <w:gridCol w:w="4927"/>
-        <w:gridCol w:w="4927"/>
-      </w:tblGrid>
-      <w:tr>
-        <w:tblPrEx>
-          <w:tblBorders>
-            <w:top w:val="none" w:color="auto" w:sz="0" w:space="0"/>
-            <w:left w:val="none" w:color="auto" w:sz="0" w:space="0"/>
-            <w:bottom w:val="none" w:color="auto" w:sz="0" w:space="0"/>
-            <w:right w:val="none" w:color="auto" w:sz="0" w:space="0"/>
-            <w:insideH w:val="none" w:color="auto" w:sz="0" w:space="0"/>
-            <w:insideV w:val="none" w:color="auto" w:sz="0" w:space="0"/>
-          </w:tblBorders>
-        </w:tblPrEx>
-        <w:tc>
-          <w:tcPr>
-            <w:tcW w:w="4927" w:type="dxa"/>
-          </w:tcPr>
-          <w:p>
-            <w:pPr>
-              <w:rPr>
-                <w:rFonts w:hint="default" w:ascii="Times New Roman" w:hAnsi="Times New Roman" w:eastAsia="Times New Roman"/>
-                <w:sz w:val="28"/>
-                <w:vertAlign w:val="baseline"/>
-              </w:rPr>
-            </w:pPr>
-          </w:p>
-        </w:tc>
-        <w:tc>
-          <w:tcPr>
-            <w:tcW w:w="4927" w:type="dxa"/>
-            <w:vAlign w:val="top"/>
-          </w:tcPr>
-          <w:p>
-            <w:pPr>
-              <w:jc w:val="both"/>
-              <w:rPr>
-                <w:rFonts w:hint="default" w:ascii="Times New Roman" w:hAnsi="Times New Roman" w:eastAsia="Times New Roman"/>
-                <w:sz w:val="28"/>
-                <w:vertAlign w:val="baseline"/>
-              </w:rPr>
-            </w:pPr>
-            <w:r>
-              <w:rPr>
-                <w:rFonts w:hint="default" w:ascii="Times New Roman" w:hAnsi="Times New Roman" w:eastAsia="Times New Roman"/>
-                <w:sz w:val="28"/>
-              </w:rPr>
-              <w:t>Начальнику адміністративної групи штабу військової частини А4960</w:t>
-            </w:r>
-          </w:p>
-        </w:tc>
-      </w:tr>
-    </w:tbl>
-    <w:p>
-      <w:pPr>
-        <w:rPr>
-          <w:rFonts w:hint="default" w:ascii="Times New Roman" w:hAnsi="Times New Roman" w:eastAsia="Times New Roman"/>
-          <w:sz w:val="28"/>
-        </w:rPr>
-      </w:pPr>
-    </w:p>
-    <w:p>
-      <w:pPr>
-        <w:rPr>
-          <w:rFonts w:hint="default" w:ascii="Times New Roman" w:hAnsi="Times New Roman" w:eastAsia="Times New Roman"/>
-          <w:sz w:val="28"/>
-        </w:rPr>
-      </w:pPr>
-      <w:r>
-        <w:rPr>
-          <w:rFonts w:hint="default" w:ascii="Times New Roman" w:hAnsi="Times New Roman" w:eastAsia="Times New Roman"/>
-          <w:sz w:val="28"/>
-        </w:rPr>
-        <w:t>Включити до наказу стосовно рапорту {{rankGenitive}} {{lastNameGenitive}} {{initials}}</w:t>
-      </w:r>
-    </w:p>
-    <w:p>
-      <w:pPr>
-        <w:rPr>
-          <w:rFonts w:hint="default" w:ascii="Times New Roman" w:hAnsi="Times New Roman" w:eastAsia="Times New Roman"/>
-          <w:sz w:val="28"/>
-        </w:rPr>
-      </w:pPr>
-    </w:p>
-    <w:p>
-      <w:pPr>
-        <w:rPr>
-          <w:rFonts w:hint="default" w:ascii="Times New Roman" w:hAnsi="Times New Roman" w:eastAsia="Times New Roman"/>
-          <w:sz w:val="28"/>
-        </w:rPr>
-      </w:pPr>
-      <w:r>
-        <w:rPr>
-          <w:rFonts w:hint="default" w:ascii="Times New Roman" w:hAnsi="Times New Roman" w:eastAsia="Times New Roman"/>
-          <w:sz w:val="28"/>
-        </w:rPr>
-        <w:t>{{unitCommanderPosition}}</w:t>
-      </w:r>
-    </w:p>
-    <w:tbl>
-      <w:tblPr>
-        <w:tblStyle w:val="7"/>
-        <w:tblW w:w="0" w:type="auto"/>
-        <w:tblInd w:w="0" w:type="dxa"/>
-        <w:tblBorders>
-          <w:top w:val="none" w:color="auto" w:sz="0" w:space="0"/>
-          <w:left w:val="none" w:color="auto" w:sz="0" w:space="0"/>
-          <w:bottom w:val="none" w:color="auto" w:sz="0" w:space="0"/>
-          <w:right w:val="none" w:color="auto" w:sz="0" w:space="0"/>
-          <w:insideH w:val="none" w:color="auto" w:sz="0" w:space="0"/>
-          <w:insideV w:val="none" w:color="auto" w:sz="0" w:space="0"/>
-        </w:tblBorders>
-        <w:tblLayout w:type="autofit"/>
-        <w:tblCellMar>
-          <w:left w:w="108" w:type="dxa"/>
+          <w:bottom w:w="0" w:type="dxa"/>
           <w:right w:w="108" w:type="dxa"/>
         </w:tblCellMar>
       </w:tblPr>
@@ -760,7 +714,136 @@
             <w:insideV w:val="none" w:color="auto" w:sz="0" w:space="0"/>
           </w:tblBorders>
           <w:tblCellMar>
+            <w:top w:w="0" w:type="dxa"/>
             <w:left w:w="108" w:type="dxa"/>
+            <w:bottom w:w="0" w:type="dxa"/>
+            <w:right w:w="108" w:type="dxa"/>
+          </w:tblCellMar>
+        </w:tblPrEx>
+        <w:tc>
+          <w:tcPr>
+            <w:tcW w:w="4927" w:type="dxa"/>
+          </w:tcPr>
+          <w:p>
+            <w:pPr>
+              <w:rPr>
+                <w:rFonts w:hint="default" w:ascii="Times New Roman" w:hAnsi="Times New Roman" w:eastAsia="Times New Roman"/>
+                <w:sz w:val="28"/>
+                <w:vertAlign w:val="baseline"/>
+              </w:rPr>
+            </w:pPr>
+          </w:p>
+        </w:tc>
+        <w:tc>
+          <w:tcPr>
+            <w:tcW w:w="4927" w:type="dxa"/>
+            <w:vAlign w:val="top"/>
+          </w:tcPr>
+          <w:p>
+            <w:pPr>
+              <w:jc w:val="both"/>
+              <w:rPr>
+                <w:rFonts w:hint="default" w:ascii="Times New Roman" w:hAnsi="Times New Roman" w:eastAsia="Times New Roman"/>
+                <w:sz w:val="28"/>
+                <w:vertAlign w:val="baseline"/>
+              </w:rPr>
+            </w:pPr>
+            <w:r>
+              <w:rPr>
+                <w:rFonts w:hint="default" w:ascii="Times New Roman" w:hAnsi="Times New Roman" w:eastAsia="Times New Roman"/>
+                <w:sz w:val="28"/>
+              </w:rPr>
+              <w:t>Начальнику адміністративної групи штабу військової частини А4960</w:t>
+            </w:r>
+          </w:p>
+        </w:tc>
+      </w:tr>
+    </w:tbl>
+    <w:p>
+      <w:pPr>
+        <w:rPr>
+          <w:rFonts w:hint="default" w:ascii="Times New Roman" w:hAnsi="Times New Roman" w:eastAsia="Times New Roman"/>
+          <w:sz w:val="28"/>
+        </w:rPr>
+      </w:pPr>
+    </w:p>
+    <w:p>
+      <w:pPr>
+        <w:rPr>
+          <w:rFonts w:hint="default" w:ascii="Times New Roman" w:hAnsi="Times New Roman" w:eastAsia="Times New Roman"/>
+          <w:sz w:val="28"/>
+        </w:rPr>
+      </w:pPr>
+      <w:r>
+        <w:rPr>
+          <w:rFonts w:hint="default" w:ascii="Times New Roman" w:hAnsi="Times New Roman" w:eastAsia="Times New Roman"/>
+          <w:sz w:val="28"/>
+        </w:rPr>
+        <w:t>Включити до наказу стосовно рапорту {{rankGenitive}} {{lastNameGenitive}} {{initials}}</w:t>
+      </w:r>
+    </w:p>
+    <w:p>
+      <w:pPr>
+        <w:rPr>
+          <w:rFonts w:hint="default" w:ascii="Times New Roman" w:hAnsi="Times New Roman" w:eastAsia="Times New Roman"/>
+          <w:sz w:val="28"/>
+        </w:rPr>
+      </w:pPr>
+    </w:p>
+    <w:p>
+      <w:pPr>
+        <w:rPr>
+          <w:rFonts w:hint="default" w:ascii="Times New Roman" w:hAnsi="Times New Roman" w:eastAsia="Times New Roman"/>
+          <w:sz w:val="28"/>
+        </w:rPr>
+      </w:pPr>
+      <w:r>
+        <w:rPr>
+          <w:rFonts w:hint="default" w:ascii="Times New Roman" w:hAnsi="Times New Roman" w:eastAsia="Times New Roman"/>
+          <w:sz w:val="28"/>
+        </w:rPr>
+        <w:t>{{unitCommanderPosition}}</w:t>
+      </w:r>
+    </w:p>
+    <w:tbl>
+      <w:tblPr>
+        <w:tblStyle w:val="7"/>
+        <w:tblW w:w="0" w:type="auto"/>
+        <w:tblInd w:w="0" w:type="dxa"/>
+        <w:tblBorders>
+          <w:top w:val="none" w:color="auto" w:sz="0" w:space="0"/>
+          <w:left w:val="none" w:color="auto" w:sz="0" w:space="0"/>
+          <w:bottom w:val="none" w:color="auto" w:sz="0" w:space="0"/>
+          <w:right w:val="none" w:color="auto" w:sz="0" w:space="0"/>
+          <w:insideH w:val="none" w:color="auto" w:sz="0" w:space="0"/>
+          <w:insideV w:val="none" w:color="auto" w:sz="0" w:space="0"/>
+        </w:tblBorders>
+        <w:tblLayout w:type="autofit"/>
+        <w:tblCellMar>
+          <w:top w:w="0" w:type="dxa"/>
+          <w:left w:w="108" w:type="dxa"/>
+          <w:bottom w:w="0" w:type="dxa"/>
+          <w:right w:w="108" w:type="dxa"/>
+        </w:tblCellMar>
+      </w:tblPr>
+      <w:tblGrid>
+        <w:gridCol w:w="4927"/>
+        <w:gridCol w:w="4927"/>
+      </w:tblGrid>
+      <w:tr>
+        <w:tblPrEx>
+          <w:tblBorders>
+            <w:top w:val="none" w:color="auto" w:sz="0" w:space="0"/>
+            <w:left w:val="none" w:color="auto" w:sz="0" w:space="0"/>
+            <w:bottom w:val="none" w:color="auto" w:sz="0" w:space="0"/>
+            <w:right w:val="none" w:color="auto" w:sz="0" w:space="0"/>
+            <w:insideH w:val="none" w:color="auto" w:sz="0" w:space="0"/>
+            <w:insideV w:val="none" w:color="auto" w:sz="0" w:space="0"/>
+          </w:tblBorders>
+          <w:tblCellMar>
+            <w:top w:w="0" w:type="dxa"/>
+            <w:left w:w="108" w:type="dxa"/>
+            <w:bottom w:w="0" w:type="dxa"/>
             <w:right w:w="108" w:type="dxa"/>
           </w:tblCellMar>
         </w:tblPrEx>

</xml_diff>

<commit_message>
feat: add position acceptance report and update soldier fields
</commit_message>
<xml_diff>
--- a/templates/vacation-report-template.docx
+++ b/templates/vacation-report-template.docx
@@ -263,6 +263,26 @@
           <w:sz w:val="28"/>
         </w:rPr>
         <w:t xml:space="preserve">{{position}} {{squad}} </w:t>
+      </w:r>
+      <w:r>
+        <w:rPr>
+          <w:rFonts w:ascii="Times New Roman" w:hAnsi="Times New Roman" w:eastAsia="Times New Roman"/>
+          <w:b w:val="0"/>
+          <w:i w:val="0"/>
+          <w:sz w:val="28"/>
+          <w:lang w:val="uk-UA"/>
+        </w:rPr>
+        <w:t>взводу</w:t>
+      </w:r>
+      <w:r>
+        <w:rPr>
+          <w:rFonts w:hint="default" w:ascii="Times New Roman" w:hAnsi="Times New Roman" w:eastAsia="Times New Roman"/>
+          <w:b w:val="0"/>
+          <w:i w:val="0"/>
+          <w:sz w:val="28"/>
+          <w:lang w:val="uk-UA"/>
+        </w:rPr>
+        <w:t xml:space="preserve"> </w:t>
       </w:r>
       <w:bookmarkStart w:id="1" w:name="_GoBack"/>
       <w:bookmarkEnd w:id="1"/>
@@ -320,12 +340,6 @@
             <w:insideH w:val="none" w:color="auto" w:sz="0" w:space="0"/>
             <w:insideV w:val="none" w:color="auto" w:sz="0" w:space="0"/>
           </w:tblBorders>
-          <w:tblCellMar>
-            <w:top w:w="0" w:type="dxa"/>
-            <w:left w:w="108" w:type="dxa"/>
-            <w:bottom w:w="0" w:type="dxa"/>
-            <w:right w:w="108" w:type="dxa"/>
-          </w:tblCellMar>
         </w:tblPrEx>
         <w:tc>
           <w:tcPr>

</xml_diff>